<commit_message>
Varianta finala, fara paginile [id] dinamice, urmeaza...
</commit_message>
<xml_diff>
--- a/public/templates/handover.docx
+++ b/public/templates/handover.docx
@@ -627,6 +627,15 @@
                 <w:lang w:val="ro-RO"/>
               </w:rPr>
               <w:t xml:space="preserve">} </w:t>
+            </w:r>
+            <w:r>
+              <w:rPr>
+                <w:rFonts w:ascii="Calibri" w:hAnsi="Calibri"/>
+                <w:sz w:val="22"/>
+                <w:szCs w:val="22"/>
+                <w:lang w:val="ro-RO"/>
+              </w:rPr>
+              <w:t xml:space="preserve">{brand} </w:t>
             </w:r>
             <w:r>
               <w:rPr>

</xml_diff>